<commit_message>
add Business Context Diagram
</commit_message>
<xml_diff>
--- a/COMP3059-High Level Requirements Template.docx
+++ b/COMP3059-High Level Requirements Template.docx
@@ -2452,9 +2452,6 @@
             <w:pPr>
               <w:pStyle w:val="160"/>
               <w:jc w:val="center"/>
-              <w:rPr>
-                <w:b/>
-              </w:rPr>
             </w:pPr>
             <w:r>
               <w:rPr>
@@ -2468,6 +2465,11 @@
               </w:rPr>
               <w:t xml:space="preserve"> Scope Area</w:t>
             </w:r>
+            <w:r>
+              <w:rPr>
+                <w:b/>
+              </w:rPr>
+            </w:r>
             <w:r/>
           </w:p>
         </w:tc>
@@ -2483,15 +2485,17 @@
             <w:pPr>
               <w:pStyle w:val="160"/>
               <w:jc w:val="center"/>
-              <w:rPr>
-                <w:b/>
-              </w:rPr>
             </w:pPr>
             <w:r>
               <w:rPr>
                 <w:b/>
               </w:rPr>
               <w:t xml:space="preserve">Description</w:t>
+            </w:r>
+            <w:r>
+              <w:rPr>
+                <w:b/>
+              </w:rPr>
             </w:r>
             <w:r/>
           </w:p>
@@ -2512,6 +2516,9 @@
             <w:pPr>
               <w:pStyle w:val="160"/>
             </w:pPr>
+            <w:r>
+              <w:t xml:space="preserve">Cultural connection app</w:t>
+            </w:r>
             <w:r/>
             <w:r/>
           </w:p>
@@ -2527,6 +2534,18 @@
             <w:pPr>
               <w:pStyle w:val="160"/>
             </w:pPr>
+            <w:r>
+              <w:t xml:space="preserve">Application responsible for providing a way for users and organizations to expand and explore new cultures.</w:t>
+            </w:r>
+            <w:r>
+              <w:t xml:space="preserve">0.1</w:t>
+            </w:r>
+            <w:r/>
+            <w:r/>
+            <w:r/>
+            <w:r/>
+            <w:r/>
+            <w:r/>
             <w:r/>
             <w:r/>
           </w:p>
@@ -2581,9 +2600,6 @@
             <w:pPr>
               <w:pStyle w:val="160"/>
               <w:jc w:val="center"/>
-              <w:rPr>
-                <w:b/>
-              </w:rPr>
             </w:pPr>
             <w:r>
               <w:rPr>
@@ -2591,6 +2607,11 @@
               </w:rPr>
               <w:t xml:space="preserve">External Entity</w:t>
             </w:r>
+            <w:r>
+              <w:rPr>
+                <w:b/>
+              </w:rPr>
+            </w:r>
             <w:r/>
           </w:p>
         </w:tc>
@@ -2606,15 +2627,17 @@
             <w:pPr>
               <w:pStyle w:val="160"/>
               <w:jc w:val="center"/>
-              <w:rPr>
-                <w:b/>
-              </w:rPr>
             </w:pPr>
             <w:r>
               <w:rPr>
                 <w:b/>
               </w:rPr>
               <w:t xml:space="preserve">Description</w:t>
+            </w:r>
+            <w:r>
+              <w:rPr>
+                <w:b/>
+              </w:rPr>
             </w:r>
             <w:r/>
           </w:p>
@@ -2635,6 +2658,12 @@
             <w:pPr>
               <w:pStyle w:val="160"/>
             </w:pPr>
+            <w:r>
+              <w:t xml:space="preserve">Users</w:t>
+            </w:r>
+            <w:r>
+              <w:t xml:space="preserve">.</w:t>
+            </w:r>
             <w:r/>
             <w:r/>
           </w:p>
@@ -2650,6 +2679,12 @@
             <w:pPr>
               <w:pStyle w:val="160"/>
             </w:pPr>
+            <w:r>
+              <w:t xml:space="preserve">The users of the site who can create, read, upload and delete events</w:t>
+            </w:r>
+            <w:r>
+              <w:t xml:space="preserve">. Upload their info, events and preferences</w:t>
+            </w:r>
             <w:r/>
             <w:r/>
           </w:p>
@@ -2670,6 +2705,9 @@
             <w:pPr>
               <w:pStyle w:val="160"/>
             </w:pPr>
+            <w:r>
+              <w:t xml:space="preserve">Organizations.</w:t>
+            </w:r>
             <w:r/>
             <w:r/>
           </w:p>
@@ -2685,6 +2723,12 @@
             <w:pPr>
               <w:pStyle w:val="160"/>
             </w:pPr>
+            <w:r>
+              <w:t xml:space="preserve">The users of the site who can create, read, upload and delete events</w:t>
+            </w:r>
+            <w:r>
+              <w:t xml:space="preserve">. Send preferences for site. Sends organization info.</w:t>
+            </w:r>
             <w:r/>
             <w:r/>
           </w:p>
@@ -2705,6 +2749,9 @@
             <w:pPr>
               <w:pStyle w:val="160"/>
             </w:pPr>
+            <w:r>
+              <w:t xml:space="preserve">Data Base</w:t>
+            </w:r>
             <w:r/>
             <w:r/>
           </w:p>
@@ -2720,6 +2767,9 @@
             <w:pPr>
               <w:pStyle w:val="160"/>
             </w:pPr>
+            <w:r>
+              <w:t xml:space="preserve">Where users info and organizational info is stored.</w:t>
+            </w:r>
             <w:r/>
             <w:r/>
           </w:p>
@@ -2740,6 +2790,9 @@
             <w:pPr>
               <w:pStyle w:val="160"/>
             </w:pPr>
+            <w:r>
+              <w:t xml:space="preserve">Site Admins</w:t>
+            </w:r>
             <w:r/>
             <w:r/>
           </w:p>
@@ -2755,41 +2808,9 @@
             <w:pPr>
               <w:pStyle w:val="160"/>
             </w:pPr>
-            <w:r/>
-            <w:r/>
-          </w:p>
-        </w:tc>
-      </w:tr>
-      <w:tr>
-        <w:trPr>
-          <w:cantSplit/>
-        </w:trPr>
-        <w:tc>
-          <w:tcPr>
-            <w:tcW w:w="2988" w:type="dxa"/>
-            <w:vAlign w:val="top"/>
-            <w:textDirection w:val="lrTb"/>
-            <w:noWrap w:val="false"/>
-          </w:tcPr>
-          <w:p>
-            <w:pPr>
-              <w:pStyle w:val="160"/>
-            </w:pPr>
-            <w:r/>
-            <w:r/>
-          </w:p>
-        </w:tc>
-        <w:tc>
-          <w:tcPr>
-            <w:tcW w:w="6210" w:type="dxa"/>
-            <w:vAlign w:val="top"/>
-            <w:textDirection w:val="lrTb"/>
-            <w:noWrap w:val="false"/>
-          </w:tcPr>
-          <w:p>
-            <w:pPr>
-              <w:pStyle w:val="160"/>
-            </w:pPr>
+            <w:r>
+              <w:t xml:space="preserve">Update and monitor site, listen to users feedback</w:t>
+            </w:r>
             <w:r/>
             <w:r/>
           </w:p>
@@ -2844,9 +2865,6 @@
             <w:pPr>
               <w:pStyle w:val="160"/>
               <w:jc w:val="center"/>
-              <w:rPr>
-                <w:b/>
-              </w:rPr>
             </w:pPr>
             <w:r>
               <w:rPr>
@@ -2854,6 +2872,11 @@
               </w:rPr>
               <w:t xml:space="preserve">Information Flows</w:t>
             </w:r>
+            <w:r>
+              <w:rPr>
+                <w:b/>
+              </w:rPr>
+            </w:r>
             <w:r/>
           </w:p>
         </w:tc>
@@ -2869,15 +2892,17 @@
             <w:pPr>
               <w:pStyle w:val="160"/>
               <w:jc w:val="center"/>
-              <w:rPr>
-                <w:b/>
-              </w:rPr>
             </w:pPr>
             <w:r>
               <w:rPr>
                 <w:b/>
               </w:rPr>
               <w:t xml:space="preserve">Description</w:t>
+            </w:r>
+            <w:r>
+              <w:rPr>
+                <w:b/>
+              </w:rPr>
             </w:r>
             <w:r/>
           </w:p>
@@ -2898,6 +2923,9 @@
             <w:pPr>
               <w:pStyle w:val="160"/>
             </w:pPr>
+            <w:r>
+              <w:t xml:space="preserve">Event info</w:t>
+            </w:r>
             <w:r/>
             <w:r/>
           </w:p>
@@ -2913,6 +2941,21 @@
             <w:pPr>
               <w:pStyle w:val="160"/>
             </w:pPr>
+            <w:r>
+              <w:t xml:space="preserve">Users</w:t>
+            </w:r>
+            <w:r>
+              <w:t xml:space="preserve">/</w:t>
+            </w:r>
+            <w:r>
+              <w:t xml:space="preserve">organizations</w:t>
+            </w:r>
+            <w:r>
+              <w:t xml:space="preserve"> send details about events to other users. Users create, read upload and delete even info on feeds and calendars</w:t>
+            </w:r>
+            <w:r>
+              <w:t xml:space="preserve">. They can update their profiles and preferences</w:t>
+            </w:r>
             <w:r/>
             <w:r/>
           </w:p>
@@ -2933,6 +2976,9 @@
             <w:pPr>
               <w:pStyle w:val="160"/>
             </w:pPr>
+            <w:r>
+              <w:t xml:space="preserve">Preferences</w:t>
+            </w:r>
             <w:r/>
             <w:r/>
           </w:p>
@@ -2948,6 +2994,24 @@
             <w:pPr>
               <w:pStyle w:val="160"/>
             </w:pPr>
+            <w:r>
+              <w:t xml:space="preserve">Users</w:t>
+            </w:r>
+            <w:r>
+              <w:t xml:space="preserve">\</w:t>
+            </w:r>
+            <w:r>
+              <w:t xml:space="preserve">organizations</w:t>
+            </w:r>
+            <w:r>
+              <w:t xml:space="preserve"> send </w:t>
+            </w:r>
+            <w:r>
+              <w:t xml:space="preserve">preferences for</w:t>
+            </w:r>
+            <w:r>
+              <w:t xml:space="preserve"> the site.</w:t>
+            </w:r>
             <w:r/>
             <w:r/>
           </w:p>
@@ -2968,6 +3032,9 @@
             <w:pPr>
               <w:pStyle w:val="160"/>
             </w:pPr>
+            <w:r>
+              <w:t xml:space="preserve">Alerts and confirmations.</w:t>
+            </w:r>
             <w:r/>
             <w:r/>
           </w:p>
@@ -2983,6 +3050,15 @@
             <w:pPr>
               <w:pStyle w:val="160"/>
             </w:pPr>
+            <w:r>
+              <w:t xml:space="preserve">Users are </w:t>
+            </w:r>
+            <w:r>
+              <w:t xml:space="preserve">sent alerts by the app </w:t>
+            </w:r>
+            <w:r>
+              <w:t xml:space="preserve">alerted that their invited have been accepted</w:t>
+            </w:r>
             <w:r/>
             <w:r/>
           </w:p>
@@ -3003,6 +3079,9 @@
             <w:pPr>
               <w:pStyle w:val="160"/>
             </w:pPr>
+            <w:r>
+              <w:t xml:space="preserve">User account info</w:t>
+            </w:r>
             <w:r/>
             <w:r/>
           </w:p>
@@ -3018,6 +3097,9 @@
             <w:pPr>
               <w:pStyle w:val="160"/>
             </w:pPr>
+            <w:r>
+              <w:t xml:space="preserve">Stored and sent by database.</w:t>
+            </w:r>
             <w:r/>
             <w:r/>
           </w:p>
@@ -3038,6 +3120,9 @@
             <w:pPr>
               <w:pStyle w:val="160"/>
             </w:pPr>
+            <w:r>
+              <w:t xml:space="preserve">Edit and maintenance of site </w:t>
+            </w:r>
             <w:r/>
             <w:r/>
           </w:p>
@@ -3053,41 +3138,9 @@
             <w:pPr>
               <w:pStyle w:val="160"/>
             </w:pPr>
-            <w:r/>
-            <w:r/>
-          </w:p>
-        </w:tc>
-      </w:tr>
-      <w:tr>
-        <w:trPr>
-          <w:cantSplit/>
-        </w:trPr>
-        <w:tc>
-          <w:tcPr>
-            <w:tcW w:w="2988" w:type="dxa"/>
-            <w:vAlign w:val="top"/>
-            <w:textDirection w:val="lrTb"/>
-            <w:noWrap w:val="false"/>
-          </w:tcPr>
-          <w:p>
-            <w:pPr>
-              <w:pStyle w:val="160"/>
-            </w:pPr>
-            <w:r/>
-            <w:r/>
-          </w:p>
-        </w:tc>
-        <w:tc>
-          <w:tcPr>
-            <w:tcW w:w="6210" w:type="dxa"/>
-            <w:vAlign w:val="top"/>
-            <w:textDirection w:val="lrTb"/>
-            <w:noWrap w:val="false"/>
-          </w:tcPr>
-          <w:p>
-            <w:pPr>
-              <w:pStyle w:val="160"/>
-            </w:pPr>
+            <w:r>
+              <w:t xml:space="preserve">Admins will maintain site and listen to user feedback about the site.</w:t>
+            </w:r>
             <w:r/>
             <w:r/>
           </w:p>

</xml_diff>